<commit_message>
Name Lana Stephens (President) as client signatory
Fills in the Client signature block with Lana Stephens, President, who
holds signatory authority for Shelter from the Storm Inc.

https://claude.ai/code/session_01XDDBQmZ7VGP2u8qdYKLTZn
</commit_message>
<xml_diff>
--- a/docs/23-services-agreement-daniel-stephens.docx
+++ b/docs/23-services-agreement-daniel-stephens.docx
@@ -426,13 +426,13 @@
     <w:p/>
     <w:p>
       <w:r>
-        <w:t>Name: ____________________________________________</w:t>
+        <w:t>Name: Lana Stephens</w:t>
       </w:r>
     </w:p>
     <w:p/>
     <w:p>
       <w:r>
-        <w:t>Title: ___________________________________________  (e.g., President)</w:t>
+        <w:t>Title: President (authorized representative with signatory authority)</w:t>
       </w:r>
     </w:p>
     <w:p/>

</xml_diff>